<commit_message>
Progress 04 Agustus 2026 0:52
</commit_message>
<xml_diff>
--- a/Berkas Tugas Akhir/Pre-Sidang/TA-006 (Form Biodata untuk pencetakan Ijazah).docx
+++ b/Berkas Tugas Akhir/Pre-Sidang/TA-006 (Form Biodata untuk pencetakan Ijazah).docx
@@ -793,7 +793,23 @@
                 <w:sz w:val="24"/>
                 <w:szCs w:val="24"/>
               </w:rPr>
-              <w:t>SKS: 144, IPK: 3,70</w:t>
+              <w:t>SKS: 144</w:t>
+            </w:r>
+            <w:r>
+              <w:rPr>
+                <w:rFonts w:ascii="Times New Roman" w:hAnsi="Times New Roman"/>
+                <w:sz w:val="24"/>
+                <w:szCs w:val="24"/>
+              </w:rPr>
+              <w:t>;</w:t>
+            </w:r>
+            <w:r>
+              <w:rPr>
+                <w:rFonts w:ascii="Times New Roman" w:hAnsi="Times New Roman"/>
+                <w:sz w:val="24"/>
+                <w:szCs w:val="24"/>
+              </w:rPr>
+              <w:t xml:space="preserve"> IPK: 3,70</w:t>
             </w:r>
           </w:p>
         </w:tc>
@@ -1495,22 +1511,8 @@
                 <w:szCs w:val="24"/>
               </w:rPr>
             </w:pPr>
-            <w:r>
-              <w:rPr>
-                <w:rFonts w:ascii="Times New Roman" w:hAnsi="Times New Roman"/>
-                <w:sz w:val="24"/>
-                <w:szCs w:val="24"/>
-              </w:rPr>
-              <w:t>9</w:t>
-            </w:r>
-            <w:r>
-              <w:rPr>
-                <w:rFonts w:ascii="Times New Roman" w:hAnsi="Times New Roman"/>
-                <w:sz w:val="24"/>
-                <w:szCs w:val="24"/>
-              </w:rPr>
-              <w:t xml:space="preserve"> Semester</w:t>
-            </w:r>
+            <w:bookmarkStart w:id="0" w:name="_GoBack"/>
+            <w:bookmarkEnd w:id="0"/>
           </w:p>
         </w:tc>
       </w:tr>
@@ -1574,14 +1576,6 @@
                 <w:szCs w:val="24"/>
               </w:rPr>
             </w:pPr>
-            <w:r>
-              <w:rPr>
-                <w:rFonts w:ascii="Times New Roman" w:hAnsi="Times New Roman"/>
-                <w:sz w:val="24"/>
-                <w:szCs w:val="24"/>
-              </w:rPr>
-              <w:t>6 Bulan</w:t>
-            </w:r>
           </w:p>
         </w:tc>
       </w:tr>
@@ -1646,8 +1640,6 @@
                 <w:szCs w:val="24"/>
               </w:rPr>
             </w:pPr>
-            <w:bookmarkStart w:id="0" w:name="_GoBack"/>
-            <w:bookmarkEnd w:id="0"/>
           </w:p>
         </w:tc>
       </w:tr>

</xml_diff>